<commit_message>
Show the Site Details, update home.js file
</commit_message>
<xml_diff>
--- a/src/docs/API_Integration_Updated.docx
+++ b/src/docs/API_Integration_Updated.docx
@@ -51,7 +51,15 @@
       </w:r>
       <w:r>
         <w:br/>
-        <w:t>When user clicks Login button, handleLogin() function runs.</w:t>
+        <w:t xml:space="preserve">When user clicks Login button, </w:t>
+      </w:r>
+      <w:proofErr w:type="spellStart"/>
+      <w:r>
+        <w:t>handleLogin</w:t>
+      </w:r>
+      <w:proofErr w:type="spellEnd"/>
+      <w:r>
+        <w:t>() function runs.</w:t>
       </w:r>
       <w:r>
         <w:br/>
@@ -87,7 +95,15 @@
       </w:r>
       <w:r>
         <w:br/>
-        <w:t>User details are saved in browser using localStorage.</w:t>
+        <w:t xml:space="preserve">User details are saved in browser using </w:t>
+      </w:r>
+      <w:proofErr w:type="spellStart"/>
+      <w:r>
+        <w:t>localStorage</w:t>
+      </w:r>
+      <w:proofErr w:type="spellEnd"/>
+      <w:r>
+        <w:t>.</w:t>
       </w:r>
       <w:r>
         <w:br/>
@@ -111,7 +127,15 @@
       </w:r>
       <w:r>
         <w:br/>
-        <w:t>Home page reads user data from localStorage.</w:t>
+        <w:t xml:space="preserve">Home page reads user data from </w:t>
+      </w:r>
+      <w:proofErr w:type="spellStart"/>
+      <w:r>
+        <w:t>localStorage</w:t>
+      </w:r>
+      <w:proofErr w:type="spellEnd"/>
+      <w:r>
+        <w:t>.</w:t>
       </w:r>
       <w:r>
         <w:br/>
@@ -144,8 +168,16 @@
     <w:p>
       <w:pPr>
         <w:pStyle w:val="Heading1"/>
+        <w:rPr>
+          <w:sz w:val="36"/>
+          <w:szCs w:val="36"/>
+        </w:rPr>
       </w:pPr>
       <w:r>
+        <w:rPr>
+          <w:sz w:val="36"/>
+          <w:szCs w:val="36"/>
+        </w:rPr>
         <w:lastRenderedPageBreak/>
         <w:t>Api.js Integration Process (Added on 2026-04-17)</w:t>
       </w:r>
@@ -156,7 +188,15 @@
       </w:r>
       <w:r>
         <w:br/>
-        <w:t>A new file Api.js is created inside src folder.</w:t>
+        <w:t xml:space="preserve">A new file Api.js is created inside </w:t>
+      </w:r>
+      <w:proofErr w:type="spellStart"/>
+      <w:r>
+        <w:t>src</w:t>
+      </w:r>
+      <w:proofErr w:type="spellEnd"/>
+      <w:r>
+        <w:t xml:space="preserve"> folder.</w:t>
       </w:r>
       <w:r>
         <w:br/>
@@ -168,7 +208,15 @@
       </w:r>
       <w:r>
         <w:br/>
-        <w:t>All API base URL is stored in one place using axios.create().</w:t>
+        <w:t xml:space="preserve">All API base URL is stored in one place using </w:t>
+      </w:r>
+      <w:proofErr w:type="spellStart"/>
+      <w:r>
+        <w:t>axios.create</w:t>
+      </w:r>
+      <w:proofErr w:type="spellEnd"/>
+      <w:r>
+        <w:t>().</w:t>
       </w:r>
       <w:r>
         <w:br/>
@@ -192,11 +240,35 @@
       </w:r>
       <w:r>
         <w:br/>
-        <w:t>Instead of axios, common api is used.</w:t>
+        <w:t xml:space="preserve">Instead of </w:t>
+      </w:r>
+      <w:proofErr w:type="spellStart"/>
+      <w:r>
+        <w:t>axios</w:t>
+      </w:r>
+      <w:proofErr w:type="spellEnd"/>
+      <w:r>
+        <w:t xml:space="preserve">, common </w:t>
+      </w:r>
+      <w:proofErr w:type="spellStart"/>
+      <w:r>
+        <w:t>api</w:t>
+      </w:r>
+      <w:proofErr w:type="spellEnd"/>
+      <w:r>
+        <w:t xml:space="preserve"> is used.</w:t>
       </w:r>
       <w:r>
         <w:br/>
-        <w:t>Example: api.post('/Account/login')</w:t>
+        <w:t xml:space="preserve">Example: </w:t>
+      </w:r>
+      <w:proofErr w:type="spellStart"/>
+      <w:r>
+        <w:t>api.post</w:t>
+      </w:r>
+      <w:proofErr w:type="spellEnd"/>
+      <w:r>
+        <w:t>('/Account/login')</w:t>
       </w:r>
       <w:r>
         <w:br/>
@@ -208,7 +280,15 @@
       </w:r>
       <w:r>
         <w:br/>
-        <w:t>API call is changed to api.get('/Brands')</w:t>
+        <w:t xml:space="preserve">API call is changed to </w:t>
+      </w:r>
+      <w:proofErr w:type="spellStart"/>
+      <w:r>
+        <w:t>api.get</w:t>
+      </w:r>
+      <w:proofErr w:type="spellEnd"/>
+      <w:r>
+        <w:t>('/Brands')</w:t>
       </w:r>
       <w:r>
         <w:br/>
@@ -219,6 +299,11 @@
       </w:r>
     </w:p>
     <w:p>
+      <w:pPr>
+        <w:rPr>
+          <w:lang w:val="en-IN"/>
+        </w:rPr>
+      </w:pPr>
       <w:r>
         <w:t>Final Updated Flow:</w:t>
       </w:r>
@@ -229,6 +314,193 @@
       <w:r>
         <w:br/>
       </w:r>
+    </w:p>
+    <w:p>
+      <w:pPr>
+        <w:rPr>
+          <w:b/>
+          <w:bCs/>
+          <w:sz w:val="36"/>
+          <w:szCs w:val="36"/>
+          <w:lang w:val="en-IN"/>
+        </w:rPr>
+      </w:pPr>
+      <w:r>
+        <w:rPr>
+          <w:b/>
+          <w:bCs/>
+          <w:sz w:val="36"/>
+          <w:szCs w:val="36"/>
+          <w:lang w:val="en-IN"/>
+        </w:rPr>
+        <w:t>SHOW THE SITE DETAILS</w:t>
+      </w:r>
+    </w:p>
+    <w:p>
+      <w:r>
+        <w:t>Step 15: Replace User Data UI</w:t>
+      </w:r>
+    </w:p>
+    <w:p>
+      <w:r>
+        <w:t>Removed user info display.</w:t>
+      </w:r>
+    </w:p>
+    <w:p/>
+    <w:p>
+      <w:r>
+        <w:t>Step 16: Fetch Site Details</w:t>
+      </w:r>
+    </w:p>
+    <w:p>
+      <w:r>
+        <w:t xml:space="preserve">API </w:t>
+      </w:r>
+      <w:proofErr w:type="gramStart"/>
+      <w:r>
+        <w:t>call</w:t>
+      </w:r>
+      <w:proofErr w:type="gramEnd"/>
+      <w:r>
+        <w:t xml:space="preserve"> to get all sites using token.</w:t>
+      </w:r>
+    </w:p>
+    <w:p/>
+    <w:p>
+      <w:r>
+        <w:t>Step 17: Store Sites in State</w:t>
+      </w:r>
+    </w:p>
+    <w:p>
+      <w:proofErr w:type="spellStart"/>
+      <w:r>
+        <w:t>useState</w:t>
+      </w:r>
+      <w:proofErr w:type="spellEnd"/>
+      <w:r>
+        <w:t xml:space="preserve"> used to store 54 site details.</w:t>
+      </w:r>
+    </w:p>
+    <w:p/>
+    <w:p>
+      <w:r>
+        <w:lastRenderedPageBreak/>
+        <w:t>Step 18: Grid UI Design</w:t>
+      </w:r>
+    </w:p>
+    <w:p>
+      <w:r>
+        <w:t>Displayed sites in card layout (row &amp; column).</w:t>
+      </w:r>
+    </w:p>
+    <w:p/>
+    <w:p>
+      <w:r>
+        <w:t>Step 19: Card View</w:t>
+      </w:r>
+    </w:p>
+    <w:p>
+      <w:r>
+        <w:t>Each site shown as a box with:</w:t>
+      </w:r>
+    </w:p>
+    <w:p>
+      <w:r>
+        <w:t>- Outlet Name</w:t>
+      </w:r>
+    </w:p>
+    <w:p>
+      <w:r>
+        <w:t>- Image</w:t>
+      </w:r>
+    </w:p>
+    <w:p/>
+    <w:p>
+      <w:r>
+        <w:t>Step 20: Click Interaction</w:t>
+      </w:r>
+    </w:p>
+    <w:p>
+      <w:r>
+        <w:t>On clicking card → show full details.</w:t>
+      </w:r>
+    </w:p>
+    <w:p/>
+    <w:p>
+      <w:r>
+        <w:t>Step 21: Detail View</w:t>
+      </w:r>
+    </w:p>
+    <w:p>
+      <w:r>
+        <w:t>Displays:</w:t>
+      </w:r>
+    </w:p>
+    <w:p>
+      <w:r>
+        <w:t>Address, Email, Corporation, etc.</w:t>
+      </w:r>
+    </w:p>
+    <w:p/>
+    <w:p>
+      <w:r>
+        <w:t>Step 22: Back Navigation</w:t>
+      </w:r>
+    </w:p>
+    <w:p>
+      <w:r>
+        <w:t>Option to return to grid.</w:t>
+      </w:r>
+    </w:p>
+    <w:p/>
+    <w:p>
+      <w:r>
+        <w:t>Step 23: Logout Button</w:t>
+      </w:r>
+    </w:p>
+    <w:p>
+      <w:proofErr w:type="gramStart"/>
+      <w:r>
+        <w:t>Clears</w:t>
+      </w:r>
+      <w:proofErr w:type="gramEnd"/>
+      <w:r>
+        <w:t xml:space="preserve"> </w:t>
+      </w:r>
+      <w:proofErr w:type="spellStart"/>
+      <w:r>
+        <w:t>localStorage</w:t>
+      </w:r>
+      <w:proofErr w:type="spellEnd"/>
+      <w:r>
+        <w:t xml:space="preserve"> and </w:t>
+      </w:r>
+      <w:proofErr w:type="gramStart"/>
+      <w:r>
+        <w:t>redirects</w:t>
+      </w:r>
+      <w:proofErr w:type="gramEnd"/>
+      <w:r>
+        <w:t xml:space="preserve"> to login.</w:t>
+      </w:r>
+    </w:p>
+    <w:p/>
+    <w:p>
+      <w:r>
+        <w:t>Final Flow:</w:t>
+      </w:r>
+    </w:p>
+    <w:p>
+      <w:r>
+        <w:t>Login → API → Token → Api.js → Fetch Sites → Grid UI → Click → Details → Logout</w:t>
+      </w:r>
+    </w:p>
+    <w:p>
+      <w:pPr>
+        <w:rPr>
+          <w:lang w:val="en-IN"/>
+        </w:rPr>
+      </w:pPr>
     </w:p>
     <w:sectPr>
       <w:pgSz w:w="12240" w:h="15840"/>

</xml_diff>

<commit_message>
/api/SiteDetail/{siteKey} , Add Edit option
</commit_message>
<xml_diff>
--- a/src/docs/API_Integration_Updated.docx
+++ b/src/docs/API_Integration_Updated.docx
@@ -15,6 +15,10 @@
     </w:p>
     <w:p>
       <w:r>
+        <w:rPr>
+          <w:b/>
+          <w:bCs/>
+        </w:rPr>
         <w:t>Step 1: App.js (Main Control)</w:t>
       </w:r>
       <w:r>
@@ -35,6 +39,10 @@
     </w:p>
     <w:p>
       <w:r>
+        <w:rPr>
+          <w:b/>
+          <w:bCs/>
+        </w:rPr>
         <w:t>Step 2: Login.js (User Input)</w:t>
       </w:r>
       <w:r>
@@ -47,6 +55,10 @@
     </w:p>
     <w:p>
       <w:r>
+        <w:rPr>
+          <w:b/>
+          <w:bCs/>
+        </w:rPr>
         <w:t>Step 3: Button Click</w:t>
       </w:r>
       <w:r>
@@ -54,12 +66,17 @@
         <w:t xml:space="preserve">When user clicks Login button, </w:t>
       </w:r>
       <w:proofErr w:type="spellStart"/>
+      <w:proofErr w:type="gramStart"/>
       <w:r>
         <w:t>handleLogin</w:t>
       </w:r>
       <w:proofErr w:type="spellEnd"/>
       <w:r>
-        <w:t>() function runs.</w:t>
+        <w:t>(</w:t>
+      </w:r>
+      <w:proofErr w:type="gramEnd"/>
+      <w:r>
+        <w:t>) function runs.</w:t>
       </w:r>
       <w:r>
         <w:br/>
@@ -67,6 +84,10 @@
     </w:p>
     <w:p>
       <w:r>
+        <w:rPr>
+          <w:b/>
+          <w:bCs/>
+        </w:rPr>
         <w:t>Step 4: API Call</w:t>
       </w:r>
       <w:r>
@@ -79,6 +100,10 @@
     </w:p>
     <w:p>
       <w:r>
+        <w:rPr>
+          <w:b/>
+          <w:bCs/>
+        </w:rPr>
         <w:t>Step 5: API Response</w:t>
       </w:r>
       <w:r>
@@ -91,6 +116,10 @@
     </w:p>
     <w:p>
       <w:r>
+        <w:rPr>
+          <w:b/>
+          <w:bCs/>
+        </w:rPr>
         <w:t>Step 6: Save Data</w:t>
       </w:r>
       <w:r>
@@ -111,6 +140,10 @@
     </w:p>
     <w:p>
       <w:r>
+        <w:rPr>
+          <w:b/>
+          <w:bCs/>
+        </w:rPr>
         <w:t>Step 7: Navigation</w:t>
       </w:r>
       <w:r>
@@ -123,6 +156,10 @@
     </w:p>
     <w:p>
       <w:r>
+        <w:rPr>
+          <w:b/>
+          <w:bCs/>
+        </w:rPr>
         <w:t>Step 8: Home.js (Read Data)</w:t>
       </w:r>
       <w:r>
@@ -143,25 +180,62 @@
     </w:p>
     <w:p>
       <w:r>
+        <w:rPr>
+          <w:b/>
+          <w:bCs/>
+        </w:rPr>
         <w:t>Step 9: Display Data</w:t>
       </w:r>
       <w:r>
         <w:br/>
-        <w:t>User name, email, and token are shown on screen.</w:t>
+      </w:r>
+      <w:proofErr w:type="gramStart"/>
+      <w:r>
+        <w:t>User name</w:t>
+      </w:r>
+      <w:proofErr w:type="gramEnd"/>
+      <w:r>
+        <w:t>, email, and token are shown on screen.</w:t>
       </w:r>
       <w:r>
         <w:br/>
       </w:r>
     </w:p>
     <w:p>
-      <w:r>
+      <w:pPr>
+        <w:rPr>
+          <w:b/>
+          <w:bCs/>
+          <w:sz w:val="24"/>
+          <w:szCs w:val="24"/>
+        </w:rPr>
+      </w:pPr>
+      <w:r>
+        <w:rPr>
+          <w:b/>
+          <w:bCs/>
+          <w:sz w:val="24"/>
+          <w:szCs w:val="24"/>
+        </w:rPr>
         <w:t>Final Flow:</w:t>
       </w:r>
       <w:r>
+        <w:rPr>
+          <w:b/>
+          <w:bCs/>
+          <w:sz w:val="24"/>
+          <w:szCs w:val="24"/>
+        </w:rPr>
         <w:br/>
         <w:t>Login → API Call → Response → Save → Navigate → Display</w:t>
       </w:r>
       <w:r>
+        <w:rPr>
+          <w:b/>
+          <w:bCs/>
+          <w:sz w:val="24"/>
+          <w:szCs w:val="24"/>
+        </w:rPr>
         <w:br/>
       </w:r>
     </w:p>
@@ -182,8 +256,13 @@
         <w:t>Api.js Integration Process (Added on 2026-04-17)</w:t>
       </w:r>
     </w:p>
+    <w:p/>
     <w:p>
       <w:r>
+        <w:rPr>
+          <w:b/>
+          <w:bCs/>
+        </w:rPr>
         <w:t>Step 10: Create Api.js (Common API File)</w:t>
       </w:r>
       <w:r>
@@ -204,6 +283,10 @@
     </w:p>
     <w:p>
       <w:r>
+        <w:rPr>
+          <w:b/>
+          <w:bCs/>
+        </w:rPr>
         <w:t>Step 11: Base URL Setup</w:t>
       </w:r>
       <w:r>
@@ -211,10 +294,12 @@
         <w:t xml:space="preserve">All API base URL is stored in one place using </w:t>
       </w:r>
       <w:proofErr w:type="spellStart"/>
+      <w:proofErr w:type="gramStart"/>
       <w:r>
         <w:t>axios.create</w:t>
       </w:r>
       <w:proofErr w:type="spellEnd"/>
+      <w:proofErr w:type="gramEnd"/>
       <w:r>
         <w:t>().</w:t>
       </w:r>
@@ -224,6 +309,10 @@
     </w:p>
     <w:p>
       <w:r>
+        <w:rPr>
+          <w:b/>
+          <w:bCs/>
+        </w:rPr>
         <w:t>Step 12: Token Handling</w:t>
       </w:r>
       <w:r>
@@ -236,6 +325,10 @@
     </w:p>
     <w:p>
       <w:r>
+        <w:rPr>
+          <w:b/>
+          <w:bCs/>
+        </w:rPr>
         <w:t>Step 13: Update Login.js</w:t>
       </w:r>
       <w:r>
@@ -276,6 +369,10 @@
     </w:p>
     <w:p>
       <w:r>
+        <w:rPr>
+          <w:b/>
+          <w:bCs/>
+        </w:rPr>
         <w:t>Step 14: Update Home.js</w:t>
       </w:r>
       <w:r>
@@ -305,6 +402,10 @@
         </w:rPr>
       </w:pPr>
       <w:r>
+        <w:rPr>
+          <w:b/>
+          <w:bCs/>
+        </w:rPr>
         <w:t>Final Updated Flow:</w:t>
       </w:r>
       <w:r>
@@ -317,6 +418,9 @@
     </w:p>
     <w:p>
       <w:pPr>
+        <w:pBdr>
+          <w:top w:val="single" w:sz="4" w:space="1" w:color="auto"/>
+        </w:pBdr>
         <w:rPr>
           <w:b/>
           <w:bCs/>
@@ -337,7 +441,17 @@
       </w:r>
     </w:p>
     <w:p>
-      <w:r>
+      <w:pPr>
+        <w:rPr>
+          <w:b/>
+          <w:bCs/>
+        </w:rPr>
+      </w:pPr>
+      <w:r>
+        <w:rPr>
+          <w:b/>
+          <w:bCs/>
+        </w:rPr>
         <w:t>Step 15: Replace User Data UI</w:t>
       </w:r>
     </w:p>
@@ -348,7 +462,17 @@
     </w:p>
     <w:p/>
     <w:p>
-      <w:r>
+      <w:pPr>
+        <w:rPr>
+          <w:b/>
+          <w:bCs/>
+        </w:rPr>
+      </w:pPr>
+      <w:r>
+        <w:rPr>
+          <w:b/>
+          <w:bCs/>
+        </w:rPr>
         <w:t>Step 16: Fetch Site Details</w:t>
       </w:r>
     </w:p>
@@ -367,7 +491,17 @@
     </w:p>
     <w:p/>
     <w:p>
-      <w:r>
+      <w:pPr>
+        <w:rPr>
+          <w:b/>
+          <w:bCs/>
+        </w:rPr>
+      </w:pPr>
+      <w:r>
+        <w:rPr>
+          <w:b/>
+          <w:bCs/>
+        </w:rPr>
         <w:t>Step 17: Store Sites in State</w:t>
       </w:r>
     </w:p>
@@ -383,8 +517,17 @@
     </w:p>
     <w:p/>
     <w:p>
-      <w:r>
-        <w:lastRenderedPageBreak/>
+      <w:pPr>
+        <w:rPr>
+          <w:b/>
+          <w:bCs/>
+        </w:rPr>
+      </w:pPr>
+      <w:r>
+        <w:rPr>
+          <w:b/>
+          <w:bCs/>
+        </w:rPr>
         <w:t>Step 18: Grid UI Design</w:t>
       </w:r>
     </w:p>
@@ -395,7 +538,17 @@
     </w:p>
     <w:p/>
     <w:p>
-      <w:r>
+      <w:pPr>
+        <w:rPr>
+          <w:b/>
+          <w:bCs/>
+        </w:rPr>
+      </w:pPr>
+      <w:r>
+        <w:rPr>
+          <w:b/>
+          <w:bCs/>
+        </w:rPr>
         <w:t>Step 19: Card View</w:t>
       </w:r>
     </w:p>
@@ -416,7 +569,17 @@
     </w:p>
     <w:p/>
     <w:p>
-      <w:r>
+      <w:pPr>
+        <w:rPr>
+          <w:b/>
+          <w:bCs/>
+        </w:rPr>
+      </w:pPr>
+      <w:r>
+        <w:rPr>
+          <w:b/>
+          <w:bCs/>
+        </w:rPr>
         <w:t>Step 20: Click Interaction</w:t>
       </w:r>
     </w:p>
@@ -427,7 +590,17 @@
     </w:p>
     <w:p/>
     <w:p>
-      <w:r>
+      <w:pPr>
+        <w:rPr>
+          <w:b/>
+          <w:bCs/>
+        </w:rPr>
+      </w:pPr>
+      <w:r>
+        <w:rPr>
+          <w:b/>
+          <w:bCs/>
+        </w:rPr>
         <w:t>Step 21: Detail View</w:t>
       </w:r>
     </w:p>
@@ -443,7 +616,17 @@
     </w:p>
     <w:p/>
     <w:p>
-      <w:r>
+      <w:pPr>
+        <w:rPr>
+          <w:b/>
+          <w:bCs/>
+        </w:rPr>
+      </w:pPr>
+      <w:r>
+        <w:rPr>
+          <w:b/>
+          <w:bCs/>
+        </w:rPr>
         <w:t>Step 22: Back Navigation</w:t>
       </w:r>
     </w:p>
@@ -454,7 +637,17 @@
     </w:p>
     <w:p/>
     <w:p>
-      <w:r>
+      <w:pPr>
+        <w:rPr>
+          <w:b/>
+          <w:bCs/>
+        </w:rPr>
+      </w:pPr>
+      <w:r>
+        <w:rPr>
+          <w:b/>
+          <w:bCs/>
+        </w:rPr>
         <w:t>Step 23: Logout Button</w:t>
       </w:r>
     </w:p>
@@ -486,14 +679,335 @@
     </w:p>
     <w:p/>
     <w:p>
-      <w:r>
+      <w:pPr>
+        <w:rPr>
+          <w:b/>
+          <w:bCs/>
+          <w:sz w:val="24"/>
+          <w:szCs w:val="24"/>
+        </w:rPr>
+      </w:pPr>
+      <w:r>
+        <w:rPr>
+          <w:b/>
+          <w:bCs/>
+          <w:sz w:val="24"/>
+          <w:szCs w:val="24"/>
+        </w:rPr>
         <w:t>Final Flow:</w:t>
       </w:r>
     </w:p>
     <w:p>
-      <w:r>
+      <w:pPr>
+        <w:rPr>
+          <w:b/>
+          <w:bCs/>
+          <w:sz w:val="24"/>
+          <w:szCs w:val="24"/>
+          <w:lang w:val="en-IN"/>
+        </w:rPr>
+      </w:pPr>
+      <w:r>
+        <w:rPr>
+          <w:b/>
+          <w:bCs/>
+          <w:sz w:val="24"/>
+          <w:szCs w:val="24"/>
+        </w:rPr>
         <w:t>Login → API → Token → Api.js → Fetch Sites → Grid UI → Click → Details → Logout</w:t>
       </w:r>
+    </w:p>
+    <w:p>
+      <w:pPr>
+        <w:rPr>
+          <w:lang w:val="en-IN"/>
+        </w:rPr>
+      </w:pPr>
+    </w:p>
+    <w:p>
+      <w:pPr>
+        <w:rPr>
+          <w:lang w:val="en-IN"/>
+        </w:rPr>
+      </w:pPr>
+    </w:p>
+    <w:p/>
+    <w:p>
+      <w:pPr>
+        <w:pBdr>
+          <w:top w:val="single" w:sz="4" w:space="1" w:color="auto"/>
+        </w:pBdr>
+        <w:rPr>
+          <w:b/>
+          <w:bCs/>
+          <w:sz w:val="24"/>
+          <w:szCs w:val="24"/>
+        </w:rPr>
+      </w:pPr>
+      <w:r>
+        <w:rPr>
+          <w:b/>
+          <w:bCs/>
+          <w:sz w:val="24"/>
+          <w:szCs w:val="24"/>
+        </w:rPr>
+        <w:t xml:space="preserve">SITE ADD &amp; UPDATE FUNCTIONALITY </w:t>
+      </w:r>
+    </w:p>
+    <w:p/>
+    <w:p>
+      <w:pPr>
+        <w:rPr>
+          <w:b/>
+          <w:bCs/>
+        </w:rPr>
+      </w:pPr>
+      <w:r>
+        <w:rPr>
+          <w:b/>
+          <w:bCs/>
+        </w:rPr>
+        <w:t>Step 24: Create Add Site Page</w:t>
+      </w:r>
+    </w:p>
+    <w:p>
+      <w:r>
+        <w:t>A new form page is created to add site details.</w:t>
+      </w:r>
+    </w:p>
+    <w:p/>
+    <w:p>
+      <w:pPr>
+        <w:rPr>
+          <w:b/>
+          <w:bCs/>
+        </w:rPr>
+      </w:pPr>
+      <w:r>
+        <w:rPr>
+          <w:b/>
+          <w:bCs/>
+        </w:rPr>
+        <w:t>Step 25: Form Fields</w:t>
+      </w:r>
+    </w:p>
+    <w:p>
+      <w:r>
+        <w:t>Input fields include:</w:t>
+      </w:r>
+    </w:p>
+    <w:p>
+      <w:r>
+        <w:t>- Outlet Name</w:t>
+      </w:r>
+    </w:p>
+    <w:p>
+      <w:r>
+        <w:t>- Address</w:t>
+      </w:r>
+    </w:p>
+    <w:p>
+      <w:r>
+        <w:t>- Email</w:t>
+      </w:r>
+    </w:p>
+    <w:p>
+      <w:r>
+        <w:t>- Corporation</w:t>
+      </w:r>
+    </w:p>
+    <w:p>
+      <w:r>
+        <w:t>- Image URL</w:t>
+      </w:r>
+    </w:p>
+    <w:p/>
+    <w:p>
+      <w:pPr>
+        <w:rPr>
+          <w:b/>
+          <w:bCs/>
+        </w:rPr>
+      </w:pPr>
+      <w:r>
+        <w:rPr>
+          <w:b/>
+          <w:bCs/>
+        </w:rPr>
+        <w:t>Step 26: Submit New Site</w:t>
+      </w:r>
+    </w:p>
+    <w:p>
+      <w:r>
+        <w:t>On form submit, API POST request is sent using api.js.</w:t>
+      </w:r>
+    </w:p>
+    <w:p/>
+    <w:p>
+      <w:pPr>
+        <w:rPr>
+          <w:b/>
+          <w:bCs/>
+        </w:rPr>
+      </w:pPr>
+      <w:r>
+        <w:rPr>
+          <w:b/>
+          <w:bCs/>
+        </w:rPr>
+        <w:t>Step 27: Update Site Page</w:t>
+      </w:r>
+    </w:p>
+    <w:p>
+      <w:r>
+        <w:t>Edit option added in site detail view.</w:t>
+      </w:r>
+    </w:p>
+    <w:p/>
+    <w:p>
+      <w:pPr>
+        <w:rPr>
+          <w:b/>
+          <w:bCs/>
+        </w:rPr>
+      </w:pPr>
+      <w:r>
+        <w:rPr>
+          <w:b/>
+          <w:bCs/>
+        </w:rPr>
+        <w:t>Step 28: Pre-fill Data</w:t>
+      </w:r>
+    </w:p>
+    <w:p>
+      <w:r>
+        <w:t>Existing site details are loaded into form fields.</w:t>
+      </w:r>
+    </w:p>
+    <w:p/>
+    <w:p>
+      <w:pPr>
+        <w:rPr>
+          <w:b/>
+          <w:bCs/>
+        </w:rPr>
+      </w:pPr>
+      <w:r>
+        <w:rPr>
+          <w:b/>
+          <w:bCs/>
+        </w:rPr>
+        <w:t>Step 29: Update API Call</w:t>
+      </w:r>
+    </w:p>
+    <w:p>
+      <w:r>
+        <w:t>PUT/PATCH request is sent to update site details.</w:t>
+      </w:r>
+    </w:p>
+    <w:p/>
+    <w:p>
+      <w:pPr>
+        <w:rPr>
+          <w:b/>
+          <w:bCs/>
+        </w:rPr>
+      </w:pPr>
+      <w:r>
+        <w:rPr>
+          <w:b/>
+          <w:bCs/>
+        </w:rPr>
+        <w:t>Step 30: Refresh Data</w:t>
+      </w:r>
+    </w:p>
+    <w:p>
+      <w:r>
+        <w:t xml:space="preserve">After </w:t>
+      </w:r>
+      <w:proofErr w:type="gramStart"/>
+      <w:r>
+        <w:t>add</w:t>
+      </w:r>
+      <w:proofErr w:type="gramEnd"/>
+      <w:r>
+        <w:t>/</w:t>
+      </w:r>
+      <w:proofErr w:type="gramStart"/>
+      <w:r>
+        <w:t>update</w:t>
+      </w:r>
+      <w:proofErr w:type="gramEnd"/>
+      <w:r>
+        <w:t>, site list is refreshed automatically.</w:t>
+      </w:r>
+    </w:p>
+    <w:p/>
+    <w:p>
+      <w:pPr>
+        <w:rPr>
+          <w:b/>
+          <w:bCs/>
+        </w:rPr>
+      </w:pPr>
+      <w:r>
+        <w:rPr>
+          <w:b/>
+          <w:bCs/>
+        </w:rPr>
+        <w:t>Step 31: Navigation Handling</w:t>
+      </w:r>
+    </w:p>
+    <w:p>
+      <w:r>
+        <w:t>After successful operation, redirect back to Home page.</w:t>
+      </w:r>
+    </w:p>
+    <w:p/>
+    <w:p>
+      <w:pPr>
+        <w:rPr>
+          <w:b/>
+          <w:bCs/>
+          <w:sz w:val="24"/>
+          <w:szCs w:val="24"/>
+        </w:rPr>
+      </w:pPr>
+      <w:r>
+        <w:rPr>
+          <w:b/>
+          <w:bCs/>
+          <w:sz w:val="24"/>
+          <w:szCs w:val="24"/>
+        </w:rPr>
+        <w:t>Final Complete Flow:</w:t>
+      </w:r>
+    </w:p>
+    <w:p>
+      <w:pPr>
+        <w:rPr>
+          <w:b/>
+          <w:bCs/>
+          <w:sz w:val="24"/>
+          <w:szCs w:val="24"/>
+        </w:rPr>
+      </w:pPr>
+      <w:r>
+        <w:rPr>
+          <w:b/>
+          <w:bCs/>
+          <w:sz w:val="24"/>
+          <w:szCs w:val="24"/>
+        </w:rPr>
+        <w:t>Login → API → Token → Api.js → Fetch Sites → Grid UI → Click → Details → Add/Update → Refresh → Logout</w:t>
+      </w:r>
+    </w:p>
+    <w:p>
+      <w:pPr>
+        <w:rPr>
+          <w:lang w:val="en-IN"/>
+        </w:rPr>
+      </w:pPr>
     </w:p>
     <w:p>
       <w:pPr>
@@ -505,6 +1019,12 @@
     <w:sectPr>
       <w:pgSz w:w="12240" w:h="15840"/>
       <w:pgMar w:top="1440" w:right="1800" w:bottom="1440" w:left="1800" w:header="720" w:footer="720" w:gutter="0"/>
+      <w:pgBorders w:offsetFrom="page">
+        <w:top w:val="single" w:sz="4" w:space="24" w:color="auto"/>
+        <w:left w:val="single" w:sz="4" w:space="24" w:color="auto"/>
+        <w:bottom w:val="single" w:sz="4" w:space="24" w:color="auto"/>
+        <w:right w:val="single" w:sz="4" w:space="24" w:color="auto"/>
+      </w:pgBorders>
       <w:cols w:space="720"/>
       <w:docGrid w:linePitch="360"/>
     </w:sectPr>
@@ -1318,7 +1838,6 @@
   <w:style w:type="character" w:default="1" w:styleId="DefaultParagraphFont">
     <w:name w:val="Default Paragraph Font"/>
     <w:uiPriority w:val="1"/>
-    <w:semiHidden/>
     <w:unhideWhenUsed/>
   </w:style>
   <w:style w:type="table" w:default="1" w:styleId="TableNormal">

</xml_diff>